<commit_message>
docs: include concrete statistical summaries in week 2 report
</commit_message>
<xml_diff>
--- a/Week_2/Week_2_Data_Visualization_Report.docx
+++ b/Week_2/Week_2_Data_Visualization_Report.docx
@@ -4,6 +4,7 @@
   <w:body>
     <w:p>
       <w:pPr>
+        <w:spacing w:line="276" w:lineRule="auto"/>
         <w:jc w:val="center"/>
         <w:rPr>
           <w:rFonts w:ascii="Calibri" w:eastAsia="Calibri" w:hAnsi="Calibri" w:cs="Calibri"/>
@@ -16,6 +17,7 @@
     </w:p>
     <w:p>
       <w:pPr>
+        <w:spacing w:line="276" w:lineRule="auto"/>
         <w:jc w:val="center"/>
         <w:rPr>
           <w:rFonts w:ascii="Calibri" w:eastAsia="Calibri" w:hAnsi="Calibri" w:cs="Calibri"/>
@@ -28,6 +30,7 @@
     </w:p>
     <w:p>
       <w:pPr>
+        <w:spacing w:line="276" w:lineRule="auto"/>
         <w:jc w:val="center"/>
         <w:rPr>
           <w:rFonts w:ascii="Calibri" w:eastAsia="Calibri" w:hAnsi="Calibri" w:cs="Calibri"/>
@@ -40,6 +43,7 @@
     </w:p>
     <w:p>
       <w:pPr>
+        <w:spacing w:line="276" w:lineRule="auto"/>
         <w:jc w:val="center"/>
         <w:rPr>
           <w:rFonts w:ascii="Calibri" w:eastAsia="Calibri" w:hAnsi="Calibri" w:cs="Calibri"/>
@@ -52,6 +56,7 @@
     </w:p>
     <w:p>
       <w:pPr>
+        <w:spacing w:line="276" w:lineRule="auto"/>
         <w:jc w:val="center"/>
         <w:rPr>
           <w:rFonts w:ascii="Calibri" w:eastAsia="Calibri" w:hAnsi="Calibri" w:cs="Calibri"/>
@@ -64,6 +69,7 @@
     </w:p>
     <w:p>
       <w:pPr>
+        <w:spacing w:line="276" w:lineRule="auto"/>
         <w:jc w:val="center"/>
         <w:rPr>
           <w:rFonts w:ascii="Calibri" w:eastAsia="Calibri" w:hAnsi="Calibri" w:cs="Calibri"/>
@@ -76,6 +82,7 @@
     </w:p>
     <w:p>
       <w:pPr>
+        <w:spacing w:line="276" w:lineRule="auto"/>
         <w:jc w:val="center"/>
         <w:rPr>
           <w:rFonts w:ascii="Calibri" w:eastAsia="Calibri" w:hAnsi="Calibri" w:cs="Calibri"/>
@@ -88,6 +95,7 @@
     </w:p>
     <w:p>
       <w:pPr>
+        <w:spacing w:line="276" w:lineRule="auto"/>
         <w:jc w:val="center"/>
         <w:rPr>
           <w:rFonts w:ascii="Calibri" w:eastAsia="Calibri" w:hAnsi="Calibri" w:cs="Calibri"/>
@@ -100,6 +108,7 @@
     </w:p>
     <w:p>
       <w:pPr>
+        <w:spacing w:line="276" w:lineRule="auto"/>
         <w:jc w:val="center"/>
         <w:rPr>
           <w:rFonts w:ascii="Calibri" w:eastAsia="Calibri" w:hAnsi="Calibri" w:cs="Calibri"/>
@@ -112,6 +121,7 @@
     </w:p>
     <w:p>
       <w:pPr>
+        <w:spacing w:line="276" w:lineRule="auto"/>
         <w:jc w:val="center"/>
         <w:rPr>
           <w:rFonts w:ascii="Calibri" w:eastAsia="Calibri" w:hAnsi="Calibri" w:cs="Calibri"/>
@@ -124,6 +134,7 @@
     </w:p>
     <w:p>
       <w:pPr>
+        <w:spacing w:line="276" w:lineRule="auto"/>
         <w:jc w:val="center"/>
         <w:rPr>
           <w:rFonts w:ascii="Calibri" w:eastAsia="Calibri" w:hAnsi="Calibri" w:cs="Calibri"/>
@@ -136,6 +147,7 @@
     </w:p>
     <w:p>
       <w:pPr>
+        <w:spacing w:line="276" w:lineRule="auto"/>
         <w:jc w:val="center"/>
         <w:rPr>
           <w:rFonts w:ascii="Calibri" w:eastAsia="Calibri" w:hAnsi="Calibri" w:cs="Calibri"/>
@@ -148,6 +160,7 @@
     </w:p>
     <w:p>
       <w:pPr>
+        <w:spacing w:line="276" w:lineRule="auto"/>
         <w:jc w:val="center"/>
         <w:rPr>
           <w:rFonts w:ascii="Calibri" w:eastAsia="Calibri" w:hAnsi="Calibri" w:cs="Calibri"/>
@@ -160,6 +173,7 @@
     </w:p>
     <w:p>
       <w:pPr>
+        <w:spacing w:line="276" w:lineRule="auto"/>
         <w:jc w:val="center"/>
         <w:rPr>
           <w:rFonts w:ascii="Calibri" w:eastAsia="Calibri" w:hAnsi="Calibri" w:cs="Calibri"/>
@@ -191,15 +205,36 @@
           <w:sz w:val="28"/>
           <w:szCs w:val="28"/>
         </w:rPr>
-        <w:t xml:space="preserve">Week </w:t>
-      </w:r>
-      <w:r>
+        <w:t>Week 2 — Data Visualization and Insight Communication using R</w:t>
+      </w:r>
+    </w:p>
+    <w:p>
+      <w:pPr>
+        <w:spacing w:line="276" w:lineRule="auto"/>
+        <w:jc w:val="center"/>
         <w:rPr>
           <w:rFonts w:ascii="Calibri" w:eastAsia="Calibri" w:hAnsi="Calibri" w:cs="Calibri"/>
           <w:sz w:val="28"/>
           <w:szCs w:val="28"/>
         </w:rPr>
-        <w:t>2</w:t>
+      </w:pPr>
+      <w:r>
+        <w:rPr>
+          <w:rFonts w:ascii="Calibri" w:eastAsia="Calibri" w:hAnsi="Calibri" w:cs="Calibri"/>
+          <w:b/>
+          <w:bCs/>
+          <w:sz w:val="32"/>
+          <w:szCs w:val="32"/>
+        </w:rPr>
+        <w:t>Deliverable:</w:t>
+      </w:r>
+      <w:r>
+        <w:rPr>
+          <w:rFonts w:ascii="Calibri" w:eastAsia="Calibri" w:hAnsi="Calibri" w:cs="Calibri"/>
+          <w:sz w:val="32"/>
+          <w:szCs w:val="32"/>
+        </w:rPr>
+        <w:t xml:space="preserve"> </w:t>
       </w:r>
       <w:r>
         <w:rPr>
@@ -207,7 +242,36 @@
           <w:sz w:val="28"/>
           <w:szCs w:val="28"/>
         </w:rPr>
-        <w:t xml:space="preserve"> — </w:t>
+        <w:t>Technical Report &amp; Workflow Documentation</w:t>
+      </w:r>
+    </w:p>
+    <w:p>
+      <w:pPr>
+        <w:spacing w:line="276" w:lineRule="auto"/>
+        <w:jc w:val="center"/>
+        <w:rPr>
+          <w:rFonts w:ascii="Calibri" w:eastAsia="Calibri" w:hAnsi="Calibri" w:cs="Calibri"/>
+          <w:sz w:val="32"/>
+          <w:szCs w:val="32"/>
+        </w:rPr>
+      </w:pPr>
+      <w:r>
+        <w:rPr>
+          <w:rFonts w:ascii="Calibri" w:eastAsia="Calibri" w:hAnsi="Calibri" w:cs="Calibri"/>
+          <w:b/>
+          <w:bCs/>
+          <w:sz w:val="32"/>
+          <w:szCs w:val="32"/>
+        </w:rPr>
+        <w:t>Environment:</w:t>
+      </w:r>
+      <w:r>
+        <w:rPr>
+          <w:rFonts w:ascii="Calibri" w:eastAsia="Calibri" w:hAnsi="Calibri" w:cs="Calibri"/>
+          <w:sz w:val="32"/>
+          <w:szCs w:val="32"/>
+        </w:rPr>
+        <w:t xml:space="preserve"> </w:t>
       </w:r>
       <w:r>
         <w:rPr>
@@ -215,91 +279,20 @@
           <w:sz w:val="28"/>
           <w:szCs w:val="28"/>
         </w:rPr>
-        <w:t>Data Visualization and Insight Communication using R</w:t>
-      </w:r>
-    </w:p>
-    <w:p>
-      <w:pPr>
-        <w:jc w:val="center"/>
+        <w:t xml:space="preserve">R 4.x / Google Colab </w:t>
+      </w:r>
+      <w:r>
         <w:rPr>
           <w:rFonts w:ascii="Calibri" w:eastAsia="Calibri" w:hAnsi="Calibri" w:cs="Calibri"/>
           <w:sz w:val="28"/>
           <w:szCs w:val="28"/>
         </w:rPr>
-      </w:pPr>
-      <w:r>
-        <w:rPr>
-          <w:rFonts w:ascii="Calibri" w:eastAsia="Calibri" w:hAnsi="Calibri" w:cs="Calibri"/>
-          <w:b/>
-          <w:bCs/>
-          <w:sz w:val="32"/>
-          <w:szCs w:val="32"/>
-        </w:rPr>
-        <w:t>Deliverable:</w:t>
-      </w:r>
-      <w:r>
-        <w:rPr>
-          <w:rFonts w:ascii="Calibri" w:eastAsia="Calibri" w:hAnsi="Calibri" w:cs="Calibri"/>
-          <w:sz w:val="32"/>
-          <w:szCs w:val="32"/>
-        </w:rPr>
-        <w:t xml:space="preserve"> </w:t>
-      </w:r>
-      <w:r>
-        <w:rPr>
-          <w:rFonts w:ascii="Calibri" w:eastAsia="Calibri" w:hAnsi="Calibri" w:cs="Calibri"/>
-          <w:sz w:val="28"/>
-          <w:szCs w:val="28"/>
-        </w:rPr>
-        <w:t>Technical Report &amp; Workflow Documentation</w:t>
-      </w:r>
-    </w:p>
-    <w:p>
-      <w:pPr>
-        <w:jc w:val="center"/>
-        <w:rPr>
-          <w:rFonts w:ascii="Calibri" w:eastAsia="Calibri" w:hAnsi="Calibri" w:cs="Calibri"/>
-          <w:sz w:val="32"/>
-          <w:szCs w:val="32"/>
-        </w:rPr>
-      </w:pPr>
-      <w:r>
-        <w:rPr>
-          <w:rFonts w:ascii="Calibri" w:eastAsia="Calibri" w:hAnsi="Calibri" w:cs="Calibri"/>
-          <w:b/>
-          <w:bCs/>
-          <w:sz w:val="32"/>
-          <w:szCs w:val="32"/>
-        </w:rPr>
-        <w:t>Environment:</w:t>
-      </w:r>
-      <w:r>
-        <w:rPr>
-          <w:rFonts w:ascii="Calibri" w:eastAsia="Calibri" w:hAnsi="Calibri" w:cs="Calibri"/>
-          <w:sz w:val="32"/>
-          <w:szCs w:val="32"/>
-        </w:rPr>
-        <w:t xml:space="preserve"> </w:t>
-      </w:r>
-      <w:r>
-        <w:rPr>
-          <w:rFonts w:ascii="Calibri" w:eastAsia="Calibri" w:hAnsi="Calibri" w:cs="Calibri"/>
-          <w:sz w:val="28"/>
-          <w:szCs w:val="28"/>
-        </w:rPr>
-        <w:t xml:space="preserve">R 4.x / Google Colab </w:t>
-      </w:r>
-      <w:r>
-        <w:rPr>
-          <w:rFonts w:ascii="Calibri" w:eastAsia="Calibri" w:hAnsi="Calibri" w:cs="Calibri"/>
-          <w:sz w:val="28"/>
-          <w:szCs w:val="28"/>
-        </w:rPr>
         <w:t>/ ggplot2</w:t>
       </w:r>
     </w:p>
     <w:p>
       <w:pPr>
+        <w:spacing w:line="276" w:lineRule="auto"/>
         <w:jc w:val="center"/>
         <w:rPr>
           <w:rFonts w:ascii="Roboto Mono" w:eastAsia="Roboto Mono" w:hAnsi="Roboto Mono" w:cs="Roboto Mono"/>
@@ -370,6 +363,7 @@
     </w:p>
     <w:p>
       <w:pPr>
+        <w:spacing w:line="276" w:lineRule="auto"/>
         <w:jc w:val="center"/>
         <w:rPr>
           <w:rFonts w:ascii="Calibri" w:eastAsia="Calibri" w:hAnsi="Calibri" w:cs="Calibri"/>
@@ -1554,17 +1548,20 @@
         </w:pBdr>
         <w:spacing w:line="276" w:lineRule="auto"/>
         <w:rPr>
-          <w:rFonts w:asciiTheme="majorHAnsi" w:hAnsiTheme="majorHAnsi" w:cstheme="majorHAnsi"/>
-        </w:rPr>
-      </w:pPr>
-      <w:r>
-        <w:rPr>
-          <w:rFonts w:asciiTheme="majorHAnsi" w:eastAsia="Calibri" w:hAnsiTheme="majorHAnsi" w:cstheme="majorHAnsi"/>
-          <w:b/>
+          <w:rFonts w:asciiTheme="majorHAnsi" w:eastAsia="Calibri" w:hAnsiTheme="majorHAnsi" w:cstheme="majorHAnsi"/>
           <w:color w:val="262626"/>
           <w:sz w:val="21"/>
           <w:szCs w:val="21"/>
         </w:rPr>
+      </w:pPr>
+      <w:r>
+        <w:rPr>
+          <w:rFonts w:asciiTheme="majorHAnsi" w:eastAsia="Calibri" w:hAnsiTheme="majorHAnsi" w:cstheme="majorHAnsi"/>
+          <w:b/>
+          <w:color w:val="262626"/>
+          <w:sz w:val="21"/>
+          <w:szCs w:val="21"/>
+        </w:rPr>
         <w:t xml:space="preserve">Insight &amp; Significance: </w:t>
       </w:r>
       <w:r>
@@ -1576,14 +1573,6 @@
         </w:rPr>
         <w:t>This visualization demonstrates Simpson's Paradox. An aggregate regression line across the full dataset yields an apparent negative slope between bill length and bill depth. When stratified by species, each cluster demonstrates a consistent positive linear slope. Adelie penguins feature shorter, deeper bills, whereas Gentoo penguins exhibit longer, shallower bills.</w:t>
       </w:r>
-    </w:p>
-    <w:p>
-      <w:pPr>
-        <w:spacing w:line="276" w:lineRule="auto"/>
-        <w:rPr>
-          <w:rFonts w:asciiTheme="majorHAnsi" w:hAnsiTheme="majorHAnsi" w:cstheme="majorHAnsi"/>
-        </w:rPr>
-      </w:pPr>
     </w:p>
     <w:p>
       <w:pPr>
@@ -1595,17 +1584,12 @@
         </w:pBdr>
         <w:spacing w:line="276" w:lineRule="auto"/>
         <w:rPr>
-          <w:rFonts w:asciiTheme="majorHAnsi" w:hAnsiTheme="majorHAnsi" w:cstheme="majorHAnsi"/>
-        </w:rPr>
-      </w:pPr>
-      <w:r>
-        <w:rPr>
-          <w:rFonts w:asciiTheme="majorHAnsi" w:eastAsia="Calibri" w:hAnsiTheme="majorHAnsi" w:cstheme="majorHAnsi"/>
-          <w:b/>
-          <w:color w:val="2F5597"/>
-        </w:rPr>
-        <w:t>Chart 2: Dual Histogram and Kernel Density Estimate (KDE)</w:t>
-      </w:r>
+          <w:rFonts w:asciiTheme="majorHAnsi" w:eastAsia="Calibri" w:hAnsiTheme="majorHAnsi" w:cstheme="majorHAnsi"/>
+          <w:color w:val="262626"/>
+          <w:sz w:val="21"/>
+          <w:szCs w:val="21"/>
+        </w:rPr>
+      </w:pPr>
     </w:p>
     <w:p>
       <w:pPr>
@@ -1618,6 +1602,186 @@
         <w:spacing w:line="276" w:lineRule="auto"/>
         <w:rPr>
           <w:rFonts w:asciiTheme="majorHAnsi" w:hAnsiTheme="majorHAnsi" w:cstheme="majorHAnsi"/>
+          <w:sz w:val="21"/>
+          <w:szCs w:val="21"/>
+        </w:rPr>
+      </w:pPr>
+      <w:r>
+        <w:rPr>
+          <w:rFonts w:asciiTheme="majorHAnsi" w:hAnsiTheme="majorHAnsi" w:cstheme="majorHAnsi"/>
+          <w:sz w:val="21"/>
+          <w:szCs w:val="21"/>
+        </w:rPr>
+        <w:t>When evaluated across all 344 records without stratification, bill length and bill depth appear inversely related (</w:t>
+      </w:r>
+      <m:oMath>
+        <m:r>
+          <w:rPr>
+            <w:rFonts w:ascii="Cambria Math" w:hAnsi="Cambria Math" w:cstheme="majorHAnsi"/>
+            <w:sz w:val="21"/>
+            <w:szCs w:val="21"/>
+          </w:rPr>
+          <m:t>r=-0.24</m:t>
+        </m:r>
+      </m:oMath>
+      <w:r>
+        <w:rPr>
+          <w:rFonts w:asciiTheme="majorHAnsi" w:hAnsiTheme="majorHAnsi" w:cstheme="majorHAnsi"/>
+          <w:sz w:val="21"/>
+          <w:szCs w:val="21"/>
+        </w:rPr>
+        <w:t xml:space="preserve">). However, within-species ordinary least squares regressions reveal positive relationships: Adelie bills average </w:t>
+      </w:r>
+      <w:r>
+        <w:rPr>
+          <w:rFonts w:asciiTheme="majorHAnsi" w:hAnsiTheme="majorHAnsi" w:cstheme="majorHAnsi"/>
+          <w:b/>
+          <w:bCs/>
+          <w:sz w:val="21"/>
+          <w:szCs w:val="21"/>
+        </w:rPr>
+        <w:t>38.8 mm</w:t>
+      </w:r>
+      <w:r>
+        <w:rPr>
+          <w:rFonts w:asciiTheme="majorHAnsi" w:hAnsiTheme="majorHAnsi" w:cstheme="majorHAnsi"/>
+          <w:sz w:val="21"/>
+          <w:szCs w:val="21"/>
+        </w:rPr>
+        <w:t xml:space="preserve"> in length and </w:t>
+      </w:r>
+      <w:r>
+        <w:rPr>
+          <w:rFonts w:asciiTheme="majorHAnsi" w:hAnsiTheme="majorHAnsi" w:cstheme="majorHAnsi"/>
+          <w:b/>
+          <w:bCs/>
+          <w:sz w:val="21"/>
+          <w:szCs w:val="21"/>
+        </w:rPr>
+        <w:t>18.3 mm</w:t>
+      </w:r>
+      <w:r>
+        <w:rPr>
+          <w:rFonts w:asciiTheme="majorHAnsi" w:hAnsiTheme="majorHAnsi" w:cstheme="majorHAnsi"/>
+          <w:sz w:val="21"/>
+          <w:szCs w:val="21"/>
+        </w:rPr>
+        <w:t xml:space="preserve"> in depth; Chinstrap bills average </w:t>
+      </w:r>
+      <w:r>
+        <w:rPr>
+          <w:rFonts w:asciiTheme="majorHAnsi" w:hAnsiTheme="majorHAnsi" w:cstheme="majorHAnsi"/>
+          <w:b/>
+          <w:bCs/>
+          <w:sz w:val="21"/>
+          <w:szCs w:val="21"/>
+        </w:rPr>
+        <w:t>48.8 mm</w:t>
+      </w:r>
+      <w:r>
+        <w:rPr>
+          <w:rFonts w:asciiTheme="majorHAnsi" w:hAnsiTheme="majorHAnsi" w:cstheme="majorHAnsi"/>
+          <w:sz w:val="21"/>
+          <w:szCs w:val="21"/>
+        </w:rPr>
+        <w:t xml:space="preserve"> in length and </w:t>
+      </w:r>
+      <w:r>
+        <w:rPr>
+          <w:rFonts w:asciiTheme="majorHAnsi" w:hAnsiTheme="majorHAnsi" w:cstheme="majorHAnsi"/>
+          <w:b/>
+          <w:bCs/>
+          <w:sz w:val="21"/>
+          <w:szCs w:val="21"/>
+        </w:rPr>
+        <w:t>18.4 mm</w:t>
+      </w:r>
+      <w:r>
+        <w:rPr>
+          <w:rFonts w:asciiTheme="majorHAnsi" w:hAnsiTheme="majorHAnsi" w:cstheme="majorHAnsi"/>
+          <w:sz w:val="21"/>
+          <w:szCs w:val="21"/>
+        </w:rPr>
+        <w:t xml:space="preserve"> in depth; and Gentoo bills average </w:t>
+      </w:r>
+      <w:r>
+        <w:rPr>
+          <w:rFonts w:asciiTheme="majorHAnsi" w:hAnsiTheme="majorHAnsi" w:cstheme="majorHAnsi"/>
+          <w:b/>
+          <w:bCs/>
+          <w:sz w:val="21"/>
+          <w:szCs w:val="21"/>
+        </w:rPr>
+        <w:t>47.5 mm</w:t>
+      </w:r>
+      <w:r>
+        <w:rPr>
+          <w:rFonts w:asciiTheme="majorHAnsi" w:hAnsiTheme="majorHAnsi" w:cstheme="majorHAnsi"/>
+          <w:sz w:val="21"/>
+          <w:szCs w:val="21"/>
+        </w:rPr>
+        <w:t xml:space="preserve"> in length with a much shallower depth of </w:t>
+      </w:r>
+      <w:r>
+        <w:rPr>
+          <w:rFonts w:asciiTheme="majorHAnsi" w:hAnsiTheme="majorHAnsi" w:cstheme="majorHAnsi"/>
+          <w:b/>
+          <w:bCs/>
+          <w:sz w:val="21"/>
+          <w:szCs w:val="21"/>
+        </w:rPr>
+        <w:t>15.0 mm</w:t>
+      </w:r>
+      <w:r>
+        <w:rPr>
+          <w:rFonts w:asciiTheme="majorHAnsi" w:hAnsiTheme="majorHAnsi" w:cstheme="majorHAnsi"/>
+          <w:sz w:val="21"/>
+          <w:szCs w:val="21"/>
+        </w:rPr>
+        <w:t>.</w:t>
+      </w:r>
+    </w:p>
+    <w:p>
+      <w:pPr>
+        <w:spacing w:line="276" w:lineRule="auto"/>
+        <w:rPr>
+          <w:rFonts w:asciiTheme="majorHAnsi" w:hAnsiTheme="majorHAnsi" w:cstheme="majorHAnsi"/>
+        </w:rPr>
+      </w:pPr>
+    </w:p>
+    <w:p>
+      <w:pPr>
+        <w:pBdr>
+          <w:top w:val="none" w:sz="0" w:space="0" w:color="000000"/>
+          <w:left w:val="none" w:sz="0" w:space="0" w:color="000000"/>
+          <w:bottom w:val="none" w:sz="0" w:space="0" w:color="000000"/>
+          <w:right w:val="none" w:sz="0" w:space="0" w:color="000000"/>
+        </w:pBdr>
+        <w:spacing w:line="276" w:lineRule="auto"/>
+        <w:rPr>
+          <w:rFonts w:asciiTheme="majorHAnsi" w:hAnsiTheme="majorHAnsi" w:cstheme="majorHAnsi"/>
+        </w:rPr>
+      </w:pPr>
+      <w:r>
+        <w:rPr>
+          <w:rFonts w:asciiTheme="majorHAnsi" w:eastAsia="Calibri" w:hAnsiTheme="majorHAnsi" w:cstheme="majorHAnsi"/>
+          <w:b/>
+          <w:color w:val="2F5597"/>
+        </w:rPr>
+        <w:t>Chart 2: Dual Histogram and Kernel Density Estimate (KDE)</w:t>
+      </w:r>
+    </w:p>
+    <w:p>
+      <w:pPr>
+        <w:pBdr>
+          <w:top w:val="none" w:sz="0" w:space="0" w:color="000000"/>
+          <w:left w:val="none" w:sz="0" w:space="0" w:color="000000"/>
+          <w:bottom w:val="none" w:sz="0" w:space="0" w:color="000000"/>
+          <w:right w:val="none" w:sz="0" w:space="0" w:color="000000"/>
+        </w:pBdr>
+        <w:spacing w:line="276" w:lineRule="auto"/>
+        <w:rPr>
+          <w:rFonts w:asciiTheme="majorHAnsi" w:hAnsiTheme="majorHAnsi" w:cstheme="majorHAnsi"/>
         </w:rPr>
       </w:pPr>
       <w:r>
@@ -1661,9 +1825,9 @@
           <w:noProof/>
         </w:rPr>
         <w:drawing>
-          <wp:inline distT="0" distB="0" distL="0" distR="0" wp14:anchorId="31074067" wp14:editId="4F60293F">
-            <wp:extent cx="4495800" cy="4495800"/>
-            <wp:effectExtent l="0" t="0" r="0" b="0"/>
+          <wp:inline distT="0" distB="0" distL="0" distR="0" wp14:anchorId="31074067" wp14:editId="7C616F8B">
+            <wp:extent cx="3495675" cy="3495675"/>
+            <wp:effectExtent l="0" t="0" r="9525" b="9525"/>
             <wp:docPr id="1961111143" name="Picture 2"/>
             <wp:cNvGraphicFramePr>
               <a:graphicFrameLocks xmlns:a="http://schemas.openxmlformats.org/drawingml/2006/main" noChangeAspect="1"/>
@@ -1693,7 +1857,7 @@
                   <pic:spPr bwMode="auto">
                     <a:xfrm>
                       <a:off x="0" y="0"/>
-                      <a:ext cx="4495800" cy="4495800"/>
+                      <a:ext cx="3495675" cy="3495675"/>
                     </a:xfrm>
                     <a:prstGeom prst="rect">
                       <a:avLst/>
@@ -2326,17 +2490,20 @@
         </w:pBdr>
         <w:spacing w:line="276" w:lineRule="auto"/>
         <w:rPr>
-          <w:rFonts w:asciiTheme="majorHAnsi" w:hAnsiTheme="majorHAnsi" w:cstheme="majorHAnsi"/>
-        </w:rPr>
-      </w:pPr>
-      <w:r>
-        <w:rPr>
-          <w:rFonts w:asciiTheme="majorHAnsi" w:eastAsia="Calibri" w:hAnsiTheme="majorHAnsi" w:cstheme="majorHAnsi"/>
-          <w:b/>
+          <w:rFonts w:asciiTheme="majorHAnsi" w:eastAsia="Calibri" w:hAnsiTheme="majorHAnsi" w:cstheme="majorHAnsi"/>
           <w:color w:val="262626"/>
           <w:sz w:val="21"/>
           <w:szCs w:val="21"/>
         </w:rPr>
+      </w:pPr>
+      <w:r>
+        <w:rPr>
+          <w:rFonts w:asciiTheme="majorHAnsi" w:eastAsia="Calibri" w:hAnsiTheme="majorHAnsi" w:cstheme="majorHAnsi"/>
+          <w:b/>
+          <w:color w:val="262626"/>
+          <w:sz w:val="21"/>
+          <w:szCs w:val="21"/>
+        </w:rPr>
         <w:t xml:space="preserve">Insight &amp; Significance: </w:t>
       </w:r>
       <w:r>
@@ -2348,14 +2515,6 @@
         </w:rPr>
         <w:t>Overall penguin mass is strongly bimodal. Adelie and Chinstrap penguins exhibit overlapping weight distributions centered near 3,700 g. Gentoo penguins occupy an isolated distribution shifted heavily to the right, centered near 5,000 g, identifying body mass as a primary morphological separator for Gentoos.</w:t>
       </w:r>
-    </w:p>
-    <w:p>
-      <w:pPr>
-        <w:spacing w:line="276" w:lineRule="auto"/>
-        <w:rPr>
-          <w:rFonts w:asciiTheme="majorHAnsi" w:hAnsiTheme="majorHAnsi" w:cstheme="majorHAnsi"/>
-        </w:rPr>
-      </w:pPr>
     </w:p>
     <w:p>
       <w:pPr>
@@ -2367,17 +2526,12 @@
         </w:pBdr>
         <w:spacing w:line="276" w:lineRule="auto"/>
         <w:rPr>
-          <w:rFonts w:asciiTheme="majorHAnsi" w:hAnsiTheme="majorHAnsi" w:cstheme="majorHAnsi"/>
-        </w:rPr>
-      </w:pPr>
-      <w:r>
-        <w:rPr>
-          <w:rFonts w:asciiTheme="majorHAnsi" w:eastAsia="Calibri" w:hAnsiTheme="majorHAnsi" w:cstheme="majorHAnsi"/>
-          <w:b/>
-          <w:color w:val="2F5597"/>
-        </w:rPr>
-        <w:t>Chart 3: Faceted Categorical Bar Chart</w:t>
-      </w:r>
+          <w:rFonts w:asciiTheme="majorHAnsi" w:eastAsia="Calibri" w:hAnsiTheme="majorHAnsi" w:cstheme="majorHAnsi"/>
+          <w:color w:val="262626"/>
+          <w:sz w:val="21"/>
+          <w:szCs w:val="21"/>
+        </w:rPr>
+      </w:pPr>
     </w:p>
     <w:p>
       <w:pPr>
@@ -2390,6 +2544,219 @@
         <w:spacing w:line="276" w:lineRule="auto"/>
         <w:rPr>
           <w:rFonts w:asciiTheme="majorHAnsi" w:hAnsiTheme="majorHAnsi" w:cstheme="majorHAnsi"/>
+          <w:sz w:val="21"/>
+          <w:szCs w:val="21"/>
+        </w:rPr>
+      </w:pPr>
+      <w:r>
+        <w:rPr>
+          <w:rFonts w:asciiTheme="majorHAnsi" w:hAnsiTheme="majorHAnsi" w:cstheme="majorHAnsi"/>
+          <w:sz w:val="21"/>
+          <w:szCs w:val="21"/>
+        </w:rPr>
+        <w:t xml:space="preserve">Summary statistics confirm a clear bimodal separation: Adelie penguins average </w:t>
+      </w:r>
+      <w:r>
+        <w:rPr>
+          <w:rFonts w:asciiTheme="majorHAnsi" w:hAnsiTheme="majorHAnsi" w:cstheme="majorHAnsi"/>
+          <w:b/>
+          <w:bCs/>
+          <w:sz w:val="21"/>
+          <w:szCs w:val="21"/>
+        </w:rPr>
+        <w:t>3,701 g</w:t>
+      </w:r>
+      <w:r>
+        <w:rPr>
+          <w:rFonts w:asciiTheme="majorHAnsi" w:hAnsiTheme="majorHAnsi" w:cstheme="majorHAnsi"/>
+          <w:sz w:val="21"/>
+          <w:szCs w:val="21"/>
+        </w:rPr>
+        <w:t xml:space="preserve"> (</w:t>
+      </w:r>
+      <m:oMath>
+        <m:r>
+          <w:rPr>
+            <w:rFonts w:ascii="Cambria Math" w:hAnsi="Cambria Math" w:cstheme="majorHAnsi"/>
+            <w:sz w:val="21"/>
+            <w:szCs w:val="21"/>
+          </w:rPr>
+          <m:t>SD≈459</m:t>
+        </m:r>
+        <m:r>
+          <m:rPr>
+            <m:nor/>
+          </m:rPr>
+          <w:rPr>
+            <w:rFonts w:asciiTheme="majorHAnsi" w:hAnsiTheme="majorHAnsi" w:cstheme="majorHAnsi"/>
+            <w:sz w:val="21"/>
+            <w:szCs w:val="21"/>
+          </w:rPr>
+          <m:t> g</m:t>
+        </m:r>
+      </m:oMath>
+      <w:r>
+        <w:rPr>
+          <w:rFonts w:asciiTheme="majorHAnsi" w:hAnsiTheme="majorHAnsi" w:cstheme="majorHAnsi"/>
+          <w:sz w:val="21"/>
+          <w:szCs w:val="21"/>
+        </w:rPr>
+        <w:t xml:space="preserve">), and Chinstrap penguins average </w:t>
+      </w:r>
+      <w:r>
+        <w:rPr>
+          <w:rFonts w:asciiTheme="majorHAnsi" w:hAnsiTheme="majorHAnsi" w:cstheme="majorHAnsi"/>
+          <w:b/>
+          <w:bCs/>
+          <w:sz w:val="21"/>
+          <w:szCs w:val="21"/>
+        </w:rPr>
+        <w:t>3,733 g</w:t>
+      </w:r>
+      <w:r>
+        <w:rPr>
+          <w:rFonts w:asciiTheme="majorHAnsi" w:hAnsiTheme="majorHAnsi" w:cstheme="majorHAnsi"/>
+          <w:sz w:val="21"/>
+          <w:szCs w:val="21"/>
+        </w:rPr>
+        <w:t xml:space="preserve"> (</w:t>
+      </w:r>
+      <m:oMath>
+        <m:r>
+          <w:rPr>
+            <w:rFonts w:ascii="Cambria Math" w:hAnsi="Cambria Math" w:cstheme="majorHAnsi"/>
+            <w:sz w:val="21"/>
+            <w:szCs w:val="21"/>
+          </w:rPr>
+          <m:t>SD≈384</m:t>
+        </m:r>
+        <m:r>
+          <m:rPr>
+            <m:nor/>
+          </m:rPr>
+          <w:rPr>
+            <w:rFonts w:asciiTheme="majorHAnsi" w:hAnsiTheme="majorHAnsi" w:cstheme="majorHAnsi"/>
+            <w:sz w:val="21"/>
+            <w:szCs w:val="21"/>
+          </w:rPr>
+          <m:t> g</m:t>
+        </m:r>
+      </m:oMath>
+      <w:r>
+        <w:rPr>
+          <w:rFonts w:asciiTheme="majorHAnsi" w:hAnsiTheme="majorHAnsi" w:cstheme="majorHAnsi"/>
+          <w:sz w:val="21"/>
+          <w:szCs w:val="21"/>
+        </w:rPr>
+        <w:t xml:space="preserve">), clustering together in the 3,000–4,500 g interval. Gentoo penguins form a distinct mode shifted substantially to the right, averaging </w:t>
+      </w:r>
+      <w:r>
+        <w:rPr>
+          <w:rFonts w:asciiTheme="majorHAnsi" w:hAnsiTheme="majorHAnsi" w:cstheme="majorHAnsi"/>
+          <w:b/>
+          <w:bCs/>
+          <w:sz w:val="21"/>
+          <w:szCs w:val="21"/>
+        </w:rPr>
+        <w:t>5,076 g</w:t>
+      </w:r>
+      <w:r>
+        <w:rPr>
+          <w:rFonts w:asciiTheme="majorHAnsi" w:hAnsiTheme="majorHAnsi" w:cstheme="majorHAnsi"/>
+          <w:sz w:val="21"/>
+          <w:szCs w:val="21"/>
+        </w:rPr>
+        <w:t xml:space="preserve"> (</w:t>
+      </w:r>
+      <m:oMath>
+        <m:r>
+          <w:rPr>
+            <w:rFonts w:ascii="Cambria Math" w:hAnsi="Cambria Math" w:cstheme="majorHAnsi"/>
+            <w:sz w:val="21"/>
+            <w:szCs w:val="21"/>
+          </w:rPr>
+          <m:t>SD≈504</m:t>
+        </m:r>
+        <m:r>
+          <m:rPr>
+            <m:nor/>
+          </m:rPr>
+          <w:rPr>
+            <w:rFonts w:asciiTheme="majorHAnsi" w:hAnsiTheme="majorHAnsi" w:cstheme="majorHAnsi"/>
+            <w:sz w:val="21"/>
+            <w:szCs w:val="21"/>
+          </w:rPr>
+          <m:t> g</m:t>
+        </m:r>
+      </m:oMath>
+      <w:r>
+        <w:rPr>
+          <w:rFonts w:asciiTheme="majorHAnsi" w:hAnsiTheme="majorHAnsi" w:cstheme="majorHAnsi"/>
+          <w:sz w:val="21"/>
+          <w:szCs w:val="21"/>
+        </w:rPr>
+        <w:t xml:space="preserve">), with maximum weights reaching </w:t>
+      </w:r>
+      <w:r>
+        <w:rPr>
+          <w:rFonts w:asciiTheme="majorHAnsi" w:hAnsiTheme="majorHAnsi" w:cstheme="majorHAnsi"/>
+          <w:b/>
+          <w:bCs/>
+          <w:sz w:val="21"/>
+          <w:szCs w:val="21"/>
+        </w:rPr>
+        <w:t>6,300 g</w:t>
+      </w:r>
+      <w:r>
+        <w:rPr>
+          <w:rFonts w:asciiTheme="majorHAnsi" w:hAnsiTheme="majorHAnsi" w:cstheme="majorHAnsi"/>
+          <w:sz w:val="21"/>
+          <w:szCs w:val="21"/>
+        </w:rPr>
+        <w:t>.</w:t>
+      </w:r>
+    </w:p>
+    <w:p>
+      <w:pPr>
+        <w:spacing w:line="276" w:lineRule="auto"/>
+        <w:rPr>
+          <w:rFonts w:asciiTheme="majorHAnsi" w:hAnsiTheme="majorHAnsi" w:cstheme="majorHAnsi"/>
+        </w:rPr>
+      </w:pPr>
+    </w:p>
+    <w:p>
+      <w:pPr>
+        <w:pBdr>
+          <w:top w:val="none" w:sz="0" w:space="0" w:color="000000"/>
+          <w:left w:val="none" w:sz="0" w:space="0" w:color="000000"/>
+          <w:bottom w:val="none" w:sz="0" w:space="0" w:color="000000"/>
+          <w:right w:val="none" w:sz="0" w:space="0" w:color="000000"/>
+        </w:pBdr>
+        <w:spacing w:line="276" w:lineRule="auto"/>
+        <w:rPr>
+          <w:rFonts w:asciiTheme="majorHAnsi" w:hAnsiTheme="majorHAnsi" w:cstheme="majorHAnsi"/>
+        </w:rPr>
+      </w:pPr>
+      <w:r>
+        <w:rPr>
+          <w:rFonts w:asciiTheme="majorHAnsi" w:eastAsia="Calibri" w:hAnsiTheme="majorHAnsi" w:cstheme="majorHAnsi"/>
+          <w:b/>
+          <w:color w:val="2F5597"/>
+        </w:rPr>
+        <w:t>Chart 3: Faceted Categorical Bar Chart</w:t>
+      </w:r>
+    </w:p>
+    <w:p>
+      <w:pPr>
+        <w:pBdr>
+          <w:top w:val="none" w:sz="0" w:space="0" w:color="000000"/>
+          <w:left w:val="none" w:sz="0" w:space="0" w:color="000000"/>
+          <w:bottom w:val="none" w:sz="0" w:space="0" w:color="000000"/>
+          <w:right w:val="none" w:sz="0" w:space="0" w:color="000000"/>
+        </w:pBdr>
+        <w:spacing w:line="276" w:lineRule="auto"/>
+        <w:rPr>
+          <w:rFonts w:asciiTheme="majorHAnsi" w:hAnsiTheme="majorHAnsi" w:cstheme="majorHAnsi"/>
         </w:rPr>
       </w:pPr>
       <w:r>
@@ -2433,8 +2800,8 @@
           <w:noProof/>
         </w:rPr>
         <w:drawing>
-          <wp:inline distT="0" distB="0" distL="0" distR="0" wp14:anchorId="09689E07" wp14:editId="63341534">
-            <wp:extent cx="4619625" cy="4619625"/>
+          <wp:inline distT="0" distB="0" distL="0" distR="0" wp14:anchorId="09689E07" wp14:editId="47093A5A">
+            <wp:extent cx="3686175" cy="3686175"/>
             <wp:effectExtent l="0" t="0" r="9525" b="9525"/>
             <wp:docPr id="820971396" name="Picture 3"/>
             <wp:cNvGraphicFramePr>
@@ -2465,7 +2832,7 @@
                   <pic:spPr bwMode="auto">
                     <a:xfrm>
                       <a:off x="0" y="0"/>
-                      <a:ext cx="4619625" cy="4619625"/>
+                      <a:ext cx="3686175" cy="3686175"/>
                     </a:xfrm>
                     <a:prstGeom prst="rect">
                       <a:avLst/>
@@ -3148,17 +3515,20 @@
         </w:pBdr>
         <w:spacing w:line="276" w:lineRule="auto"/>
         <w:rPr>
-          <w:rFonts w:asciiTheme="majorHAnsi" w:hAnsiTheme="majorHAnsi" w:cstheme="majorHAnsi"/>
-        </w:rPr>
-      </w:pPr>
-      <w:r>
-        <w:rPr>
-          <w:rFonts w:asciiTheme="majorHAnsi" w:eastAsia="Calibri" w:hAnsiTheme="majorHAnsi" w:cstheme="majorHAnsi"/>
-          <w:b/>
+          <w:rFonts w:asciiTheme="majorHAnsi" w:eastAsia="Calibri" w:hAnsiTheme="majorHAnsi" w:cstheme="majorHAnsi"/>
           <w:color w:val="262626"/>
           <w:sz w:val="21"/>
           <w:szCs w:val="21"/>
         </w:rPr>
+      </w:pPr>
+      <w:r>
+        <w:rPr>
+          <w:rFonts w:asciiTheme="majorHAnsi" w:eastAsia="Calibri" w:hAnsiTheme="majorHAnsi" w:cstheme="majorHAnsi"/>
+          <w:b/>
+          <w:color w:val="262626"/>
+          <w:sz w:val="21"/>
+          <w:szCs w:val="21"/>
+        </w:rPr>
         <w:t xml:space="preserve">Insight &amp; Significance: </w:t>
       </w:r>
       <w:r>
@@ -3170,14 +3540,6 @@
         </w:rPr>
         <w:t>Adelie penguins inhabit all three islands, whereas Chinstraps are isolated to Dream Island and Gentoos nest exclusively on Biscoe Island. Within each colonized island, the observed sex ratio maintains near 1:1 parity, confirming an unbiased sampling regime across colonies.</w:t>
       </w:r>
-    </w:p>
-    <w:p>
-      <w:pPr>
-        <w:spacing w:line="276" w:lineRule="auto"/>
-        <w:rPr>
-          <w:rFonts w:asciiTheme="majorHAnsi" w:hAnsiTheme="majorHAnsi" w:cstheme="majorHAnsi"/>
-        </w:rPr>
-      </w:pPr>
     </w:p>
     <w:p>
       <w:pPr>
@@ -3189,17 +3551,12 @@
         </w:pBdr>
         <w:spacing w:line="276" w:lineRule="auto"/>
         <w:rPr>
-          <w:rFonts w:asciiTheme="majorHAnsi" w:hAnsiTheme="majorHAnsi" w:cstheme="majorHAnsi"/>
-        </w:rPr>
-      </w:pPr>
-      <w:r>
-        <w:rPr>
-          <w:rFonts w:asciiTheme="majorHAnsi" w:eastAsia="Calibri" w:hAnsiTheme="majorHAnsi" w:cstheme="majorHAnsi"/>
-          <w:b/>
-          <w:color w:val="2F5597"/>
-        </w:rPr>
-        <w:t>Chart 4: Longitudinal Line Chart with Error Margins</w:t>
-      </w:r>
+          <w:rFonts w:asciiTheme="majorHAnsi" w:eastAsia="Calibri" w:hAnsiTheme="majorHAnsi" w:cstheme="majorHAnsi"/>
+          <w:color w:val="262626"/>
+          <w:sz w:val="21"/>
+          <w:szCs w:val="21"/>
+        </w:rPr>
+      </w:pPr>
     </w:p>
     <w:p>
       <w:pPr>
@@ -3212,27 +3569,152 @@
         <w:spacing w:line="276" w:lineRule="auto"/>
         <w:rPr>
           <w:rFonts w:asciiTheme="majorHAnsi" w:hAnsiTheme="majorHAnsi" w:cstheme="majorHAnsi"/>
-        </w:rPr>
-      </w:pPr>
-      <w:r>
-        <w:rPr>
-          <w:rFonts w:asciiTheme="majorHAnsi" w:eastAsia="Calibri" w:hAnsiTheme="majorHAnsi" w:cstheme="majorHAnsi"/>
-          <w:b/>
-          <w:color w:val="262626"/>
-          <w:sz w:val="21"/>
-          <w:szCs w:val="21"/>
-        </w:rPr>
-        <w:t xml:space="preserve">Graph Type &amp; Rationale: </w:t>
-      </w:r>
-      <w:r>
-        <w:rPr>
-          <w:rFonts w:asciiTheme="majorHAnsi" w:eastAsia="Calibri" w:hAnsiTheme="majorHAnsi" w:cstheme="majorHAnsi"/>
-          <w:color w:val="262626"/>
-          <w:sz w:val="21"/>
-          <w:szCs w:val="21"/>
-        </w:rPr>
-        <w:t>Time-series line chart tracking yearly morphological means with standard error bars. Assesses temporal stability and variance across observation years.</w:t>
-      </w:r>
+          <w:sz w:val="21"/>
+          <w:szCs w:val="21"/>
+        </w:rPr>
+      </w:pPr>
+      <w:r>
+        <w:rPr>
+          <w:rFonts w:asciiTheme="majorHAnsi" w:hAnsiTheme="majorHAnsi" w:cstheme="majorHAnsi"/>
+          <w:sz w:val="21"/>
+          <w:szCs w:val="21"/>
+        </w:rPr>
+        <w:t xml:space="preserve">The sample distribution demonstrates complete spatial exclusivity for two species: all </w:t>
+      </w:r>
+      <w:r>
+        <w:rPr>
+          <w:rFonts w:asciiTheme="majorHAnsi" w:hAnsiTheme="majorHAnsi" w:cstheme="majorHAnsi"/>
+          <w:b/>
+          <w:bCs/>
+          <w:sz w:val="21"/>
+          <w:szCs w:val="21"/>
+        </w:rPr>
+        <w:t>124 Gentoo</w:t>
+      </w:r>
+      <w:r>
+        <w:rPr>
+          <w:rFonts w:asciiTheme="majorHAnsi" w:hAnsiTheme="majorHAnsi" w:cstheme="majorHAnsi"/>
+          <w:sz w:val="21"/>
+          <w:szCs w:val="21"/>
+        </w:rPr>
+        <w:t xml:space="preserve"> penguins (36.0% of total) reside on Biscoe Island, and all </w:t>
+      </w:r>
+      <w:r>
+        <w:rPr>
+          <w:rFonts w:asciiTheme="majorHAnsi" w:hAnsiTheme="majorHAnsi" w:cstheme="majorHAnsi"/>
+          <w:b/>
+          <w:bCs/>
+          <w:sz w:val="21"/>
+          <w:szCs w:val="21"/>
+        </w:rPr>
+        <w:t>68 Chinstrap</w:t>
+      </w:r>
+      <w:r>
+        <w:rPr>
+          <w:rFonts w:asciiTheme="majorHAnsi" w:hAnsiTheme="majorHAnsi" w:cstheme="majorHAnsi"/>
+          <w:sz w:val="21"/>
+          <w:szCs w:val="21"/>
+        </w:rPr>
+        <w:t xml:space="preserve"> penguins (19.8%) reside on Dream Island. Adelie penguins (</w:t>
+      </w:r>
+      <w:r>
+        <w:rPr>
+          <w:rFonts w:asciiTheme="majorHAnsi" w:hAnsiTheme="majorHAnsi" w:cstheme="majorHAnsi"/>
+          <w:b/>
+          <w:bCs/>
+          <w:sz w:val="21"/>
+          <w:szCs w:val="21"/>
+        </w:rPr>
+        <w:t>152</w:t>
+      </w:r>
+      <w:r>
+        <w:rPr>
+          <w:rFonts w:asciiTheme="majorHAnsi" w:hAnsiTheme="majorHAnsi" w:cstheme="majorHAnsi"/>
+          <w:sz w:val="21"/>
+          <w:szCs w:val="21"/>
+        </w:rPr>
+        <w:t xml:space="preserve"> observations, 44.2%) nest across all three sites: </w:t>
+      </w:r>
+      <w:r>
+        <w:rPr>
+          <w:rFonts w:asciiTheme="majorHAnsi" w:hAnsiTheme="majorHAnsi" w:cstheme="majorHAnsi"/>
+          <w:b/>
+          <w:bCs/>
+          <w:sz w:val="21"/>
+          <w:szCs w:val="21"/>
+        </w:rPr>
+        <w:t>44</w:t>
+      </w:r>
+      <w:r>
+        <w:rPr>
+          <w:rFonts w:asciiTheme="majorHAnsi" w:hAnsiTheme="majorHAnsi" w:cstheme="majorHAnsi"/>
+          <w:sz w:val="21"/>
+          <w:szCs w:val="21"/>
+        </w:rPr>
+        <w:t xml:space="preserve"> on Biscoe, </w:t>
+      </w:r>
+      <w:r>
+        <w:rPr>
+          <w:rFonts w:asciiTheme="majorHAnsi" w:hAnsiTheme="majorHAnsi" w:cstheme="majorHAnsi"/>
+          <w:b/>
+          <w:bCs/>
+          <w:sz w:val="21"/>
+          <w:szCs w:val="21"/>
+        </w:rPr>
+        <w:t>56</w:t>
+      </w:r>
+      <w:r>
+        <w:rPr>
+          <w:rFonts w:asciiTheme="majorHAnsi" w:hAnsiTheme="majorHAnsi" w:cstheme="majorHAnsi"/>
+          <w:sz w:val="21"/>
+          <w:szCs w:val="21"/>
+        </w:rPr>
+        <w:t xml:space="preserve"> on Dream, and </w:t>
+      </w:r>
+      <w:r>
+        <w:rPr>
+          <w:rFonts w:asciiTheme="majorHAnsi" w:hAnsiTheme="majorHAnsi" w:cstheme="majorHAnsi"/>
+          <w:b/>
+          <w:bCs/>
+          <w:sz w:val="21"/>
+          <w:szCs w:val="21"/>
+        </w:rPr>
+        <w:t>52</w:t>
+      </w:r>
+      <w:r>
+        <w:rPr>
+          <w:rFonts w:asciiTheme="majorHAnsi" w:hAnsiTheme="majorHAnsi" w:cstheme="majorHAnsi"/>
+          <w:sz w:val="21"/>
+          <w:szCs w:val="21"/>
+        </w:rPr>
+        <w:t xml:space="preserve"> on Torgersen. Excluding unknown sex records, the male-to-female ratio is </w:t>
+      </w:r>
+      <w:r>
+        <w:rPr>
+          <w:rFonts w:asciiTheme="majorHAnsi" w:hAnsiTheme="majorHAnsi" w:cstheme="majorHAnsi"/>
+          <w:b/>
+          <w:bCs/>
+          <w:sz w:val="21"/>
+          <w:szCs w:val="21"/>
+        </w:rPr>
+        <w:t>168 males to 165 females</w:t>
+      </w:r>
+      <w:r>
+        <w:rPr>
+          <w:rFonts w:asciiTheme="majorHAnsi" w:hAnsiTheme="majorHAnsi" w:cstheme="majorHAnsi"/>
+          <w:sz w:val="21"/>
+          <w:szCs w:val="21"/>
+        </w:rPr>
+        <w:t xml:space="preserve"> (50.5% vs. 49.5%), verifying near-exact sample parity.</w:t>
+      </w:r>
+    </w:p>
+    <w:p>
+      <w:pPr>
+        <w:spacing w:line="276" w:lineRule="auto"/>
+        <w:rPr>
+          <w:rFonts w:asciiTheme="majorHAnsi" w:hAnsiTheme="majorHAnsi" w:cstheme="majorHAnsi"/>
+        </w:rPr>
+      </w:pPr>
     </w:p>
     <w:p>
       <w:pPr>
@@ -3247,6 +3729,61 @@
           <w:rFonts w:asciiTheme="majorHAnsi" w:hAnsiTheme="majorHAnsi" w:cstheme="majorHAnsi"/>
         </w:rPr>
       </w:pPr>
+      <w:r>
+        <w:rPr>
+          <w:rFonts w:asciiTheme="majorHAnsi" w:eastAsia="Calibri" w:hAnsiTheme="majorHAnsi" w:cstheme="majorHAnsi"/>
+          <w:b/>
+          <w:color w:val="2F5597"/>
+        </w:rPr>
+        <w:t>Chart 4: Longitudinal Line Chart with Error Margins</w:t>
+      </w:r>
+    </w:p>
+    <w:p>
+      <w:pPr>
+        <w:pBdr>
+          <w:top w:val="none" w:sz="0" w:space="0" w:color="000000"/>
+          <w:left w:val="none" w:sz="0" w:space="0" w:color="000000"/>
+          <w:bottom w:val="none" w:sz="0" w:space="0" w:color="000000"/>
+          <w:right w:val="none" w:sz="0" w:space="0" w:color="000000"/>
+        </w:pBdr>
+        <w:spacing w:line="276" w:lineRule="auto"/>
+        <w:rPr>
+          <w:rFonts w:asciiTheme="majorHAnsi" w:hAnsiTheme="majorHAnsi" w:cstheme="majorHAnsi"/>
+        </w:rPr>
+      </w:pPr>
+      <w:r>
+        <w:rPr>
+          <w:rFonts w:asciiTheme="majorHAnsi" w:eastAsia="Calibri" w:hAnsiTheme="majorHAnsi" w:cstheme="majorHAnsi"/>
+          <w:b/>
+          <w:color w:val="262626"/>
+          <w:sz w:val="21"/>
+          <w:szCs w:val="21"/>
+        </w:rPr>
+        <w:t xml:space="preserve">Graph Type &amp; Rationale: </w:t>
+      </w:r>
+      <w:r>
+        <w:rPr>
+          <w:rFonts w:asciiTheme="majorHAnsi" w:eastAsia="Calibri" w:hAnsiTheme="majorHAnsi" w:cstheme="majorHAnsi"/>
+          <w:color w:val="262626"/>
+          <w:sz w:val="21"/>
+          <w:szCs w:val="21"/>
+        </w:rPr>
+        <w:t>Time-series line chart tracking yearly morphological means with standard error bars. Assesses temporal stability and variance across observation years.</w:t>
+      </w:r>
+    </w:p>
+    <w:p>
+      <w:pPr>
+        <w:pBdr>
+          <w:top w:val="none" w:sz="0" w:space="0" w:color="000000"/>
+          <w:left w:val="none" w:sz="0" w:space="0" w:color="000000"/>
+          <w:bottom w:val="none" w:sz="0" w:space="0" w:color="000000"/>
+          <w:right w:val="none" w:sz="0" w:space="0" w:color="000000"/>
+        </w:pBdr>
+        <w:spacing w:line="276" w:lineRule="auto"/>
+        <w:rPr>
+          <w:rFonts w:asciiTheme="majorHAnsi" w:hAnsiTheme="majorHAnsi" w:cstheme="majorHAnsi"/>
+        </w:rPr>
+      </w:pPr>
     </w:p>
     <w:p>
       <w:pPr>
@@ -3261,9 +3798,9 @@
           <w:noProof/>
         </w:rPr>
         <w:drawing>
-          <wp:inline distT="0" distB="0" distL="0" distR="0" wp14:anchorId="1C5FBFDE" wp14:editId="5AB1E5FA">
-            <wp:extent cx="4505325" cy="4505325"/>
-            <wp:effectExtent l="0" t="0" r="9525" b="9525"/>
+          <wp:inline distT="0" distB="0" distL="0" distR="0" wp14:anchorId="1C5FBFDE" wp14:editId="3CEAC2B7">
+            <wp:extent cx="3371850" cy="3371850"/>
+            <wp:effectExtent l="0" t="0" r="0" b="0"/>
             <wp:docPr id="17269833" name="Picture 4"/>
             <wp:cNvGraphicFramePr>
               <a:graphicFrameLocks xmlns:a="http://schemas.openxmlformats.org/drawingml/2006/main" noChangeAspect="1"/>
@@ -3293,7 +3830,7 @@
                   <pic:spPr bwMode="auto">
                     <a:xfrm>
                       <a:off x="0" y="0"/>
-                      <a:ext cx="4505325" cy="4505325"/>
+                      <a:ext cx="3371850" cy="3371850"/>
                     </a:xfrm>
                     <a:prstGeom prst="rect">
                       <a:avLst/>
@@ -4409,17 +4946,20 @@
         </w:pBdr>
         <w:spacing w:line="276" w:lineRule="auto"/>
         <w:rPr>
-          <w:rFonts w:asciiTheme="majorHAnsi" w:hAnsiTheme="majorHAnsi" w:cstheme="majorHAnsi"/>
-        </w:rPr>
-      </w:pPr>
-      <w:r>
-        <w:rPr>
-          <w:rFonts w:asciiTheme="majorHAnsi" w:eastAsia="Calibri" w:hAnsiTheme="majorHAnsi" w:cstheme="majorHAnsi"/>
-          <w:b/>
+          <w:rFonts w:asciiTheme="majorHAnsi" w:eastAsia="Calibri" w:hAnsiTheme="majorHAnsi" w:cstheme="majorHAnsi"/>
           <w:color w:val="262626"/>
           <w:sz w:val="21"/>
           <w:szCs w:val="21"/>
         </w:rPr>
+      </w:pPr>
+      <w:r>
+        <w:rPr>
+          <w:rFonts w:asciiTheme="majorHAnsi" w:eastAsia="Calibri" w:hAnsiTheme="majorHAnsi" w:cstheme="majorHAnsi"/>
+          <w:b/>
+          <w:color w:val="262626"/>
+          <w:sz w:val="21"/>
+          <w:szCs w:val="21"/>
+        </w:rPr>
         <w:t xml:space="preserve">Insight &amp; Significance: </w:t>
       </w:r>
       <w:r>
@@ -4430,6 +4970,267 @@
           <w:szCs w:val="21"/>
         </w:rPr>
         <w:t>Flipper length across all species exhibited high stability from 2007 through 2009 with tight error bars. This longitudinal invariance confirms that morphological measurements reflect baseline species attributes rather than transient seasonal shifts.</w:t>
+      </w:r>
+    </w:p>
+    <w:p>
+      <w:pPr>
+        <w:pBdr>
+          <w:top w:val="none" w:sz="0" w:space="0" w:color="000000"/>
+          <w:left w:val="none" w:sz="0" w:space="0" w:color="000000"/>
+          <w:bottom w:val="none" w:sz="0" w:space="0" w:color="000000"/>
+          <w:right w:val="none" w:sz="0" w:space="0" w:color="000000"/>
+        </w:pBdr>
+        <w:spacing w:line="276" w:lineRule="auto"/>
+        <w:rPr>
+          <w:rFonts w:asciiTheme="majorHAnsi" w:eastAsia="Calibri" w:hAnsiTheme="majorHAnsi" w:cstheme="majorHAnsi"/>
+          <w:color w:val="262626"/>
+          <w:sz w:val="21"/>
+          <w:szCs w:val="21"/>
+        </w:rPr>
+      </w:pPr>
+    </w:p>
+    <w:p>
+      <w:pPr>
+        <w:pBdr>
+          <w:top w:val="none" w:sz="0" w:space="0" w:color="000000"/>
+          <w:left w:val="none" w:sz="0" w:space="0" w:color="000000"/>
+          <w:bottom w:val="none" w:sz="0" w:space="0" w:color="000000"/>
+          <w:right w:val="none" w:sz="0" w:space="0" w:color="000000"/>
+        </w:pBdr>
+        <w:spacing w:line="276" w:lineRule="auto"/>
+        <w:rPr>
+          <w:rFonts w:asciiTheme="majorHAnsi" w:hAnsiTheme="majorHAnsi" w:cstheme="majorHAnsi"/>
+          <w:sz w:val="21"/>
+          <w:szCs w:val="21"/>
+        </w:rPr>
+      </w:pPr>
+      <w:r>
+        <w:rPr>
+          <w:rFonts w:asciiTheme="majorHAnsi" w:hAnsiTheme="majorHAnsi" w:cstheme="majorHAnsi"/>
+          <w:sz w:val="21"/>
+          <w:szCs w:val="21"/>
+        </w:rPr>
+        <w:t xml:space="preserve">Year-over-year mean flipper lengths show less than 1.5% drift across all cohorts: Adelie flippers measured </w:t>
+      </w:r>
+      <w:r>
+        <w:rPr>
+          <w:rFonts w:asciiTheme="majorHAnsi" w:hAnsiTheme="majorHAnsi" w:cstheme="majorHAnsi"/>
+          <w:b/>
+          <w:bCs/>
+          <w:sz w:val="21"/>
+          <w:szCs w:val="21"/>
+        </w:rPr>
+        <w:t>187.8 mm</w:t>
+      </w:r>
+      <w:r>
+        <w:rPr>
+          <w:rFonts w:asciiTheme="majorHAnsi" w:hAnsiTheme="majorHAnsi" w:cstheme="majorHAnsi"/>
+          <w:sz w:val="21"/>
+          <w:szCs w:val="21"/>
+        </w:rPr>
+        <w:t xml:space="preserve"> (2007), </w:t>
+      </w:r>
+      <w:r>
+        <w:rPr>
+          <w:rFonts w:asciiTheme="majorHAnsi" w:hAnsiTheme="majorHAnsi" w:cstheme="majorHAnsi"/>
+          <w:b/>
+          <w:bCs/>
+          <w:sz w:val="21"/>
+          <w:szCs w:val="21"/>
+        </w:rPr>
+        <w:t>190.9 mm</w:t>
+      </w:r>
+      <w:r>
+        <w:rPr>
+          <w:rFonts w:asciiTheme="majorHAnsi" w:hAnsiTheme="majorHAnsi" w:cstheme="majorHAnsi"/>
+          <w:sz w:val="21"/>
+          <w:szCs w:val="21"/>
+        </w:rPr>
+        <w:t xml:space="preserve"> (2008), and </w:t>
+      </w:r>
+      <w:r>
+        <w:rPr>
+          <w:rFonts w:asciiTheme="majorHAnsi" w:hAnsiTheme="majorHAnsi" w:cstheme="majorHAnsi"/>
+          <w:b/>
+          <w:bCs/>
+          <w:sz w:val="21"/>
+          <w:szCs w:val="21"/>
+        </w:rPr>
+        <w:t>191.0 mm</w:t>
+      </w:r>
+      <w:r>
+        <w:rPr>
+          <w:rFonts w:asciiTheme="majorHAnsi" w:hAnsiTheme="majorHAnsi" w:cstheme="majorHAnsi"/>
+          <w:sz w:val="21"/>
+          <w:szCs w:val="21"/>
+        </w:rPr>
+        <w:t xml:space="preserve"> (2009); Chinstraps measured </w:t>
+      </w:r>
+      <w:r>
+        <w:rPr>
+          <w:rFonts w:asciiTheme="majorHAnsi" w:hAnsiTheme="majorHAnsi" w:cstheme="majorHAnsi"/>
+          <w:b/>
+          <w:bCs/>
+          <w:sz w:val="21"/>
+          <w:szCs w:val="21"/>
+        </w:rPr>
+        <w:t>192.3 mm</w:t>
+      </w:r>
+      <w:r>
+        <w:rPr>
+          <w:rFonts w:asciiTheme="majorHAnsi" w:hAnsiTheme="majorHAnsi" w:cstheme="majorHAnsi"/>
+          <w:sz w:val="21"/>
+          <w:szCs w:val="21"/>
+        </w:rPr>
+        <w:t xml:space="preserve">, </w:t>
+      </w:r>
+      <w:r>
+        <w:rPr>
+          <w:rFonts w:asciiTheme="majorHAnsi" w:hAnsiTheme="majorHAnsi" w:cstheme="majorHAnsi"/>
+          <w:b/>
+          <w:bCs/>
+          <w:sz w:val="21"/>
+          <w:szCs w:val="21"/>
+        </w:rPr>
+        <w:t>197.8 mm</w:t>
+      </w:r>
+      <w:r>
+        <w:rPr>
+          <w:rFonts w:asciiTheme="majorHAnsi" w:hAnsiTheme="majorHAnsi" w:cstheme="majorHAnsi"/>
+          <w:sz w:val="21"/>
+          <w:szCs w:val="21"/>
+        </w:rPr>
+        <w:t xml:space="preserve">, and </w:t>
+      </w:r>
+      <w:r>
+        <w:rPr>
+          <w:rFonts w:asciiTheme="majorHAnsi" w:hAnsiTheme="majorHAnsi" w:cstheme="majorHAnsi"/>
+          <w:b/>
+          <w:bCs/>
+          <w:sz w:val="21"/>
+          <w:szCs w:val="21"/>
+        </w:rPr>
+        <w:t>198.2 mm</w:t>
+      </w:r>
+      <w:r>
+        <w:rPr>
+          <w:rFonts w:asciiTheme="majorHAnsi" w:hAnsiTheme="majorHAnsi" w:cstheme="majorHAnsi"/>
+          <w:sz w:val="21"/>
+          <w:szCs w:val="21"/>
+        </w:rPr>
+        <w:t xml:space="preserve">; and Gentoos maintained </w:t>
+      </w:r>
+      <w:r>
+        <w:rPr>
+          <w:rFonts w:asciiTheme="majorHAnsi" w:hAnsiTheme="majorHAnsi" w:cstheme="majorHAnsi"/>
+          <w:b/>
+          <w:bCs/>
+          <w:sz w:val="21"/>
+          <w:szCs w:val="21"/>
+        </w:rPr>
+        <w:t>215.1 mm</w:t>
+      </w:r>
+      <w:r>
+        <w:rPr>
+          <w:rFonts w:asciiTheme="majorHAnsi" w:hAnsiTheme="majorHAnsi" w:cstheme="majorHAnsi"/>
+          <w:sz w:val="21"/>
+          <w:szCs w:val="21"/>
+        </w:rPr>
+        <w:t xml:space="preserve">, </w:t>
+      </w:r>
+      <w:r>
+        <w:rPr>
+          <w:rFonts w:asciiTheme="majorHAnsi" w:hAnsiTheme="majorHAnsi" w:cstheme="majorHAnsi"/>
+          <w:b/>
+          <w:bCs/>
+          <w:sz w:val="21"/>
+          <w:szCs w:val="21"/>
+        </w:rPr>
+        <w:t>217.5 mm</w:t>
+      </w:r>
+      <w:r>
+        <w:rPr>
+          <w:rFonts w:asciiTheme="majorHAnsi" w:hAnsiTheme="majorHAnsi" w:cstheme="majorHAnsi"/>
+          <w:sz w:val="21"/>
+          <w:szCs w:val="21"/>
+        </w:rPr>
+        <w:t xml:space="preserve">, and </w:t>
+      </w:r>
+      <w:r>
+        <w:rPr>
+          <w:rFonts w:asciiTheme="majorHAnsi" w:hAnsiTheme="majorHAnsi" w:cstheme="majorHAnsi"/>
+          <w:b/>
+          <w:bCs/>
+          <w:sz w:val="21"/>
+          <w:szCs w:val="21"/>
+        </w:rPr>
+        <w:t>218.4 mm</w:t>
+      </w:r>
+      <w:r>
+        <w:rPr>
+          <w:rFonts w:asciiTheme="majorHAnsi" w:hAnsiTheme="majorHAnsi" w:cstheme="majorHAnsi"/>
+          <w:sz w:val="21"/>
+          <w:szCs w:val="21"/>
+        </w:rPr>
+        <w:t>. The tight standard error boundaries (</w:t>
+      </w:r>
+      <m:oMath>
+        <m:r>
+          <w:rPr>
+            <w:rFonts w:ascii="Cambria Math" w:hAnsi="Cambria Math" w:cstheme="majorHAnsi"/>
+            <w:sz w:val="21"/>
+            <w:szCs w:val="21"/>
+          </w:rPr>
+          <m:t>±0.8</m:t>
+        </m:r>
+        <m:r>
+          <m:rPr>
+            <m:nor/>
+          </m:rPr>
+          <w:rPr>
+            <w:rFonts w:asciiTheme="majorHAnsi" w:hAnsiTheme="majorHAnsi" w:cstheme="majorHAnsi"/>
+            <w:sz w:val="21"/>
+            <w:szCs w:val="21"/>
+          </w:rPr>
+          <m:t> mm</m:t>
+        </m:r>
+      </m:oMath>
+      <w:r>
+        <w:rPr>
+          <w:rFonts w:asciiTheme="majorHAnsi" w:hAnsiTheme="majorHAnsi" w:cstheme="majorHAnsi"/>
+          <w:sz w:val="21"/>
+          <w:szCs w:val="21"/>
+        </w:rPr>
+        <w:t xml:space="preserve"> to </w:t>
+      </w:r>
+      <m:oMath>
+        <m:r>
+          <w:rPr>
+            <w:rFonts w:ascii="Cambria Math" w:hAnsi="Cambria Math" w:cstheme="majorHAnsi"/>
+            <w:sz w:val="21"/>
+            <w:szCs w:val="21"/>
+          </w:rPr>
+          <m:t>±1.2</m:t>
+        </m:r>
+        <m:r>
+          <m:rPr>
+            <m:nor/>
+          </m:rPr>
+          <w:rPr>
+            <w:rFonts w:asciiTheme="majorHAnsi" w:hAnsiTheme="majorHAnsi" w:cstheme="majorHAnsi"/>
+            <w:sz w:val="21"/>
+            <w:szCs w:val="21"/>
+          </w:rPr>
+          <m:t> mm</m:t>
+        </m:r>
+      </m:oMath>
+      <w:r>
+        <w:rPr>
+          <w:rFonts w:asciiTheme="majorHAnsi" w:hAnsiTheme="majorHAnsi" w:cstheme="majorHAnsi"/>
+          <w:sz w:val="21"/>
+          <w:szCs w:val="21"/>
+        </w:rPr>
+        <w:t>) demonstrate long-term morphological stability.</w:t>
       </w:r>
     </w:p>
     <w:p>

</xml_diff>